<commit_message>
fix(docx): Wrap docxtemplater loop tags in w:t elements to fix word parsing error and populate data properly
</commit_message>
<xml_diff>
--- a/frontend/public/templates/daily-template.docx
+++ b/frontend/public/templates/daily-template.docx
@@ -1,7 +1,7 @@
 
 <file path=word/document.xml><?xml version="1.0" encoding="UTF-8" standalone="yes"?>
 <w:document xmlns:pic="http://schemas.openxmlformats.org/drawingml/2006/picture" xmlns:a="http://schemas.openxmlformats.org/drawingml/2006/main" xmlns:wpc="http://schemas.microsoft.com/office/word/2010/wordprocessingCanvas" xmlns:cx="http://schemas.microsoft.com/office/drawing/2014/chartex" xmlns:cx1="http://schemas.microsoft.com/office/drawing/2015/9/8/chartex" xmlns:cx2="http://schemas.microsoft.com/office/drawing/2015/10/21/chartex" xmlns:cx3="http://schemas.microsoft.com/office/drawing/2016/5/9/chartex" xmlns:cx4="http://schemas.microsoft.com/office/drawing/2016/5/10/chartex" xmlns:cx5="http://schemas.microsoft.com/office/drawing/2016/5/11/chartex" xmlns:cx6="http://schemas.microsoft.com/office/drawing/2016/5/12/chartex" xmlns:cx7="http://schemas.microsoft.com/office/drawing/2016/5/13/chartex" xmlns:cx8="http://schemas.microsoft.com/office/drawing/2016/5/14/chartex" xmlns:mc="http://schemas.openxmlformats.org/markup-compatibility/2006" xmlns:aink="http://schemas.microsoft.com/office/drawing/2016/ink" xmlns:am3d="http://schemas.microsoft.com/office/drawing/2017/model3d" xmlns:o="urn:schemas-microsoft-com:office:office" xmlns:r="http://schemas.openxmlformats.org/officeDocument/2006/relationships" xmlns:m="http://schemas.openxmlformats.org/officeDocument/2006/math" xmlns:v="urn:schemas-microsoft-com:vml" xmlns:wp14="http://schemas.microsoft.com/office/word/2010/wordprocessingDrawing" xmlns:wp="http://schemas.openxmlformats.org/drawingml/2006/wordprocessingDrawing" xmlns:w10="urn:schemas-microsoft-com:office:word" xmlns:w="http://schemas.openxmlformats.org/wordprocessingml/2006/main" xmlns:w14="http://schemas.microsoft.com/office/word/2010/wordml" xmlns:w15="http://schemas.microsoft.com/office/word/2012/wordml" xmlns:w16cex="http://schemas.microsoft.com/office/word/2018/wordml/cex" xmlns:w16cid="http://schemas.microsoft.com/office/word/2016/wordml/cid" xmlns:w16="http://schemas.microsoft.com/office/word/2018/wordml" xmlns:w16sdtdh="http://schemas.microsoft.com/office/word/2020/wordml/sdtdatahash" xmlns:w16se="http://schemas.microsoft.com/office/word/2015/wordml/symex" xmlns:wpg="http://schemas.microsoft.com/office/word/2010/wordprocessingGroup" xmlns:wpi="http://schemas.microsoft.com/office/word/2010/wordprocessingInk" xmlns:wne="http://schemas.microsoft.com/office/word/2006/wordml" xmlns:wps="http://schemas.microsoft.com/office/word/2010/wordprocessingShape" mc:Ignorable="w14 w15 w16se w16cid w16 w16cex w16sdtdh wp14"><w:body>
-{#incidents}
+<w:p><w:pPr><w:spacing w:after="100" w:line="240" w:lineRule="auto"/></w:pPr><w:r><w:rPr><w:rFonts w:ascii="Arial" w:hAnsi="Arial" w:cs="Arial"/><w:color w:val="000000"/><w:sz w:val="24"/><w:szCs w:val="24"/></w:rPr><w:t xml:space="preserve">{#incidents}</w:t></w:r></w:p>
 <w:p><w:pPr><w:jc w:val="center"/><w:spacing w:before="120" w:after="120" w:line="240" w:lineRule="auto"/></w:pPr><w:r><w:rPr><w:rFonts w:ascii="Arial" w:hAnsi="Arial" w:cs="Arial"/><w:b/><w:bCs/><w:color w:val="000000"/><w:sz w:val="24"/><w:szCs w:val="24"/></w:rPr><w:t xml:space="preserve">INCIDENT REPORT</w:t></w:r></w:p>
 <w:p><w:pPr><w:spacing w:after="100" w:line="240" w:lineRule="auto"/></w:pPr></w:p>
 <w:p><w:pPr><w:jc w:val="both"/><w:spacing w:before="100" w:after="100" w:line="240" w:lineRule="auto"/></w:pPr><w:r><w:rPr><w:rFonts w:ascii="Arial" w:hAnsi="Arial" w:cs="Arial"/><w:color w:val="000000"/><w:sz w:val="24"/><w:szCs w:val="24"/></w:rPr><w:t xml:space="preserve">       That on or about </w:t></w:r><w:r><w:rPr><w:rFonts w:ascii="Arial" w:hAnsi="Arial" w:cs="Arial"/><w:b/><w:bCs/><w:color w:val="000000"/><w:sz w:val="24"/><w:szCs w:val="24"/></w:rPr><w:t xml:space="preserve">{time}</w:t></w:r><w:r><w:rPr><w:rFonts w:ascii="Arial" w:hAnsi="Arial" w:cs="Arial"/><w:color w:val="000000"/><w:sz w:val="24"/><w:szCs w:val="24"/></w:rPr><w:t xml:space="preserve"> of </w:t></w:r><w:r><w:rPr><w:rFonts w:ascii="Arial" w:hAnsi="Arial" w:cs="Arial"/><w:b/><w:bCs/><w:color w:val="000000"/><w:sz w:val="24"/><w:szCs w:val="24"/></w:rPr><w:t xml:space="preserve">{date}</w:t></w:r><w:r><w:rPr><w:rFonts w:ascii="Arial" w:hAnsi="Arial" w:cs="Arial"/><w:color w:val="000000"/><w:sz w:val="24"/><w:szCs w:val="24"/></w:rPr><w:t xml:space="preserve">, a </w:t></w:r><w:r><w:rPr><w:rFonts w:ascii="Arial" w:hAnsi="Arial" w:cs="Arial"/><w:b/><w:bCs/><w:color w:val="000000"/><w:sz w:val="24"/><w:szCs w:val="24"/></w:rPr><w:t xml:space="preserve">{incident_type}</w:t></w:r><w:r><w:rPr><w:rFonts w:ascii="Arial" w:hAnsi="Arial" w:cs="Arial"/><w:color w:val="000000"/><w:sz w:val="24"/><w:szCs w:val="24"/></w:rPr><w:t xml:space="preserve"> occurred at </w:t></w:r><w:r><w:rPr><w:rFonts w:ascii="Arial" w:hAnsi="Arial" w:cs="Arial"/><w:b/><w:bCs/><w:color w:val="000000"/><w:sz w:val="24"/><w:szCs w:val="24"/></w:rPr><w:t xml:space="preserve">{location}.</w:t></w:r></w:p>
@@ -80,7 +80,7 @@
   </w:r>
 </w:p>
 
-{/incidents}
+<w:p><w:pPr><w:spacing w:after="100" w:line="240" w:lineRule="auto"/></w:pPr><w:r><w:rPr><w:rFonts w:ascii="Arial" w:hAnsi="Arial" w:cs="Arial"/><w:color w:val="000000"/><w:sz w:val="24"/><w:szCs w:val="24"/></w:rPr><w:t xml:space="preserve">{/incidents}</w:t></w:r></w:p>
 <w:sectPr><w:headerReference w:type="default" r:id="rId82"/><w:footerReference w:type="default" r:id="rId83"/><w:pgSz w:w="12240" w:h="18720" w:code="14"/><w:pgMar w:top="1440" w:right="1440" w:bottom="1440" w:left="1440" w:header="708" w:footer="708" w:gutter="0"/><w:cols w:space="708"/><w:docGrid w:linePitch="360"/></w:sectPr></w:body></w:document>
 </file>
 

</xml_diff>

<commit_message>
fix(docx): Escape ampersand chars in section headers to produce strictly valid XML
</commit_message>
<xml_diff>
--- a/frontend/public/templates/daily-template.docx
+++ b/frontend/public/templates/daily-template.docx
@@ -1,87 +1,1129 @@
 
-<file path=word/document.xml><?xml version="1.0" encoding="UTF-8" standalone="yes"?>
-<w:document xmlns:pic="http://schemas.openxmlformats.org/drawingml/2006/picture" xmlns:a="http://schemas.openxmlformats.org/drawingml/2006/main" xmlns:wpc="http://schemas.microsoft.com/office/word/2010/wordprocessingCanvas" xmlns:cx="http://schemas.microsoft.com/office/drawing/2014/chartex" xmlns:cx1="http://schemas.microsoft.com/office/drawing/2015/9/8/chartex" xmlns:cx2="http://schemas.microsoft.com/office/drawing/2015/10/21/chartex" xmlns:cx3="http://schemas.microsoft.com/office/drawing/2016/5/9/chartex" xmlns:cx4="http://schemas.microsoft.com/office/drawing/2016/5/10/chartex" xmlns:cx5="http://schemas.microsoft.com/office/drawing/2016/5/11/chartex" xmlns:cx6="http://schemas.microsoft.com/office/drawing/2016/5/12/chartex" xmlns:cx7="http://schemas.microsoft.com/office/drawing/2016/5/13/chartex" xmlns:cx8="http://schemas.microsoft.com/office/drawing/2016/5/14/chartex" xmlns:mc="http://schemas.openxmlformats.org/markup-compatibility/2006" xmlns:aink="http://schemas.microsoft.com/office/drawing/2016/ink" xmlns:am3d="http://schemas.microsoft.com/office/drawing/2017/model3d" xmlns:o="urn:schemas-microsoft-com:office:office" xmlns:r="http://schemas.openxmlformats.org/officeDocument/2006/relationships" xmlns:m="http://schemas.openxmlformats.org/officeDocument/2006/math" xmlns:v="urn:schemas-microsoft-com:vml" xmlns:wp14="http://schemas.microsoft.com/office/word/2010/wordprocessingDrawing" xmlns:wp="http://schemas.openxmlformats.org/drawingml/2006/wordprocessingDrawing" xmlns:w10="urn:schemas-microsoft-com:office:word" xmlns:w="http://schemas.openxmlformats.org/wordprocessingml/2006/main" xmlns:w14="http://schemas.microsoft.com/office/word/2010/wordml" xmlns:w15="http://schemas.microsoft.com/office/word/2012/wordml" xmlns:w16cex="http://schemas.microsoft.com/office/word/2018/wordml/cex" xmlns:w16cid="http://schemas.microsoft.com/office/word/2016/wordml/cid" xmlns:w16="http://schemas.microsoft.com/office/word/2018/wordml" xmlns:w16sdtdh="http://schemas.microsoft.com/office/word/2020/wordml/sdtdatahash" xmlns:w16se="http://schemas.microsoft.com/office/word/2015/wordml/symex" xmlns:wpg="http://schemas.microsoft.com/office/word/2010/wordprocessingGroup" xmlns:wpi="http://schemas.microsoft.com/office/word/2010/wordprocessingInk" xmlns:wne="http://schemas.microsoft.com/office/word/2006/wordml" xmlns:wps="http://schemas.microsoft.com/office/word/2010/wordprocessingShape" mc:Ignorable="w14 w15 w16se w16cid w16 w16cex w16sdtdh wp14"><w:body>
-<w:p><w:pPr><w:spacing w:after="100" w:line="240" w:lineRule="auto"/></w:pPr><w:r><w:rPr><w:rFonts w:ascii="Arial" w:hAnsi="Arial" w:cs="Arial"/><w:color w:val="000000"/><w:sz w:val="24"/><w:szCs w:val="24"/></w:rPr><w:t xml:space="preserve">{#incidents}</w:t></w:r></w:p>
-<w:p><w:pPr><w:jc w:val="center"/><w:spacing w:before="120" w:after="120" w:line="240" w:lineRule="auto"/></w:pPr><w:r><w:rPr><w:rFonts w:ascii="Arial" w:hAnsi="Arial" w:cs="Arial"/><w:b/><w:bCs/><w:color w:val="000000"/><w:sz w:val="24"/><w:szCs w:val="24"/></w:rPr><w:t xml:space="preserve">INCIDENT REPORT</w:t></w:r></w:p>
-<w:p><w:pPr><w:spacing w:after="100" w:line="240" w:lineRule="auto"/></w:pPr></w:p>
-<w:p><w:pPr><w:jc w:val="both"/><w:spacing w:before="100" w:after="100" w:line="240" w:lineRule="auto"/></w:pPr><w:r><w:rPr><w:rFonts w:ascii="Arial" w:hAnsi="Arial" w:cs="Arial"/><w:color w:val="000000"/><w:sz w:val="24"/><w:szCs w:val="24"/></w:rPr><w:t xml:space="preserve">       That on or about </w:t></w:r><w:r><w:rPr><w:rFonts w:ascii="Arial" w:hAnsi="Arial" w:cs="Arial"/><w:b/><w:bCs/><w:color w:val="000000"/><w:sz w:val="24"/><w:szCs w:val="24"/></w:rPr><w:t xml:space="preserve">{time}</w:t></w:r><w:r><w:rPr><w:rFonts w:ascii="Arial" w:hAnsi="Arial" w:cs="Arial"/><w:color w:val="000000"/><w:sz w:val="24"/><w:szCs w:val="24"/></w:rPr><w:t xml:space="preserve"> of </w:t></w:r><w:r><w:rPr><w:rFonts w:ascii="Arial" w:hAnsi="Arial" w:cs="Arial"/><w:b/><w:bCs/><w:color w:val="000000"/><w:sz w:val="24"/><w:szCs w:val="24"/></w:rPr><w:t xml:space="preserve">{date}</w:t></w:r><w:r><w:rPr><w:rFonts w:ascii="Arial" w:hAnsi="Arial" w:cs="Arial"/><w:color w:val="000000"/><w:sz w:val="24"/><w:szCs w:val="24"/></w:rPr><w:t xml:space="preserve">, a </w:t></w:r><w:r><w:rPr><w:rFonts w:ascii="Arial" w:hAnsi="Arial" w:cs="Arial"/><w:b/><w:bCs/><w:color w:val="000000"/><w:sz w:val="24"/><w:szCs w:val="24"/></w:rPr><w:t xml:space="preserve">{incident_type}</w:t></w:r><w:r><w:rPr><w:rFonts w:ascii="Arial" w:hAnsi="Arial" w:cs="Arial"/><w:color w:val="000000"/><w:sz w:val="24"/><w:szCs w:val="24"/></w:rPr><w:t xml:space="preserve"> occurred at </w:t></w:r><w:r><w:rPr><w:rFonts w:ascii="Arial" w:hAnsi="Arial" w:cs="Arial"/><w:b/><w:bCs/><w:color w:val="000000"/><w:sz w:val="24"/><w:szCs w:val="24"/></w:rPr><w:t xml:space="preserve">{location}.</w:t></w:r></w:p>
-<w:p><w:pPr><w:jc w:val="both"/><w:spacing w:before="100" w:after="100" w:line="240" w:lineRule="auto"/></w:pPr><w:r><w:rPr><w:rFonts w:ascii="Arial" w:hAnsi="Arial" w:cs="Arial"/><w:color w:val="000000"/><w:sz w:val="24"/><w:szCs w:val="24"/></w:rPr><w:t xml:space="preserve">       That the incident was reported by </w:t></w:r><w:r><w:rPr><w:rFonts w:ascii="Arial" w:hAnsi="Arial" w:cs="Arial"/><w:b/><w:bCs/><w:color w:val="000000"/><w:sz w:val="24"/><w:szCs w:val="24"/></w:rPr><w:t xml:space="preserve">{reporter_name}</w:t></w:r><w:r><w:rPr><w:rFonts w:ascii="Arial" w:hAnsi="Arial" w:cs="Arial"/><w:color w:val="000000"/><w:sz w:val="24"/><w:szCs w:val="24"/></w:rPr><w:t xml:space="preserve">{reporter_phone}. {narrative}</w:t></w:r></w:p>
-<w:p><w:pPr><w:jc w:val="both"/><w:spacing w:before="100" w:after="100" w:line="240" w:lineRule="auto"/></w:pPr><w:r><w:rPr><w:rFonts w:ascii="Arial" w:hAnsi="Arial" w:cs="Arial"/><w:color w:val="000000"/><w:sz w:val="24"/><w:szCs w:val="24"/></w:rPr><w:t xml:space="preserve">       That the Municipal Disaster Risk Reduction and Management Office (</w:t></w:r><w:r><w:rPr><w:rFonts w:ascii="Arial" w:hAnsi="Arial" w:cs="Arial"/><w:b/><w:bCs/><w:color w:val="000000"/><w:sz w:val="24"/><w:szCs w:val="24"/></w:rPr><w:t xml:space="preserve">MDRRMO</w:t></w:r><w:r><w:rPr><w:rFonts w:ascii="Arial" w:hAnsi="Arial" w:cs="Arial"/><w:color w:val="000000"/><w:sz w:val="24"/><w:szCs w:val="24"/></w:rPr><w:t xml:space="preserve">) emergency responders immediately responded to the scene to assess the situation and provide proper care management in accordance with standard operating procedures.</w:t></w:r></w:p>
-<w:p><w:pPr><w:spacing w:after="100" w:line="240" w:lineRule="auto"/></w:pPr></w:p>
-
-<w:p><w:pPr><w:jc w:val="both"/><w:spacing w:before="100" w:after="100" w:line="240" w:lineRule="auto"/></w:pPr><w:r><w:rPr><w:rFonts w:ascii="Arial" w:hAnsi="Arial" w:cs="Arial"/><w:b/><w:bCs/><w:color w:val="1E293B"/><w:sz w:val="26"/><w:szCs w:val="26"/></w:rPr><w:t xml:space="preserve">INCIDENT RESOLUTION & QUESTIONNAIRE DETAILS</w:t></w:r></w:p>
-<w:p><w:pPr><w:spacing w:after="100" w:line="240" w:lineRule="auto"/></w:pPr></w:p>
-
-<w:p><w:pPr><w:jc w:val="both"/><w:spacing w:before="100" w:after="100" w:line="240" w:lineRule="auto"/></w:pPr><w:r><w:rPr><w:rFonts w:ascii="Arial" w:hAnsi="Arial" w:cs="Arial"/><w:b/><w:bCs/><w:color w:val="000000"/><w:sz w:val="24"/><w:szCs w:val="24"/></w:rPr><w:t xml:space="preserve">1. Patient Information:</w:t></w:r></w:p>
-<w:p><w:pPr><w:jc w:val="both"/><w:spacing w:before="100" w:after="100" w:line="240" w:lineRule="auto"/></w:pPr><w:r><w:rPr><w:rFonts w:ascii="Arial" w:hAnsi="Arial" w:cs="Arial"/><w:color w:val="000000"/><w:sz w:val="24"/><w:szCs w:val="24"/></w:rPr><w:t xml:space="preserve">• Name: </w:t></w:r><w:r><w:rPr><w:rFonts w:ascii="Arial" w:hAnsi="Arial" w:cs="Arial"/><w:b/><w:bCs/><w:color w:val="000000"/><w:sz w:val="24"/><w:szCs w:val="24"/></w:rPr><w:t xml:space="preserve">{patient_name}</w:t></w:r><w:r><w:rPr><w:rFonts w:ascii="Arial" w:hAnsi="Arial" w:cs="Arial"/><w:color w:val="000000"/><w:sz w:val="24"/><w:szCs w:val="24"/></w:rPr><w:t xml:space="preserve">  |  Age: </w:t></w:r><w:r><w:rPr><w:rFonts w:ascii="Arial" w:hAnsi="Arial" w:cs="Arial"/><w:b/><w:bCs/><w:color w:val="000000"/><w:sz w:val="24"/><w:szCs w:val="24"/></w:rPr><w:t xml:space="preserve">{patient_age}</w:t></w:r><w:r><w:rPr><w:rFonts w:ascii="Arial" w:hAnsi="Arial" w:cs="Arial"/><w:color w:val="000000"/><w:sz w:val="24"/><w:szCs w:val="24"/></w:rPr><w:t xml:space="preserve">  |  Sex: </w:t></w:r><w:r><w:rPr><w:rFonts w:ascii="Arial" w:hAnsi="Arial" w:cs="Arial"/><w:b/><w:bCs/><w:color w:val="000000"/><w:sz w:val="24"/><w:szCs w:val="24"/></w:rPr><w:t xml:space="preserve">{patient_sex}</w:t></w:r></w:p>
-<w:p><w:pPr><w:jc w:val="both"/><w:spacing w:before="100" w:after="100" w:line="240" w:lineRule="auto"/></w:pPr><w:r><w:rPr><w:rFonts w:ascii="Arial" w:hAnsi="Arial" w:cs="Arial"/><w:color w:val="000000"/><w:sz w:val="24"/><w:szCs w:val="24"/></w:rPr><w:t xml:space="preserve">• Address: </w:t></w:r><w:r><w:rPr><w:rFonts w:ascii="Arial" w:hAnsi="Arial" w:cs="Arial"/><w:color w:val="000000"/><w:sz w:val="24"/><w:szCs w:val="24"/></w:rPr><w:t xml:space="preserve">{patient_address}</w:t></w:r></w:p>
-<w:p><w:pPr><w:spacing w:after="100" w:line="240" w:lineRule="auto"/></w:pPr></w:p>
-
-<w:p><w:pPr><w:jc w:val="both"/><w:spacing w:before="100" w:after="100" w:line="240" w:lineRule="auto"/></w:pPr><w:r><w:rPr><w:rFonts w:ascii="Arial" w:hAnsi="Arial" w:cs="Arial"/><w:b/><w:bCs/><w:color w:val="000000"/><w:sz w:val="24"/><w:szCs w:val="24"/></w:rPr><w:t xml:space="preserve">2. Incident Cause & Mechanism:</w:t></w:r></w:p>
-<w:p><w:pPr><w:jc w:val="both"/><w:spacing w:before="100" w:after="100" w:line="240" w:lineRule="auto"/></w:pPr><w:r><w:rPr><w:rFonts w:ascii="Arial" w:hAnsi="Arial" w:cs="Arial"/><w:color w:val="000000"/><w:sz w:val="24"/><w:szCs w:val="24"/></w:rPr><w:t xml:space="preserve">• Mechanism of Injury / Cause: </w:t></w:r><w:r><w:rPr><w:rFonts w:ascii="Arial" w:hAnsi="Arial" w:cs="Arial"/><w:b/><w:bCs/><w:color w:val="000000"/><w:sz w:val="24"/><w:szCs w:val="24"/></w:rPr><w:t xml:space="preserve">{mechanism_of_injury}</w:t></w:r></w:p>
-<w:p><w:pPr><w:jc w:val="both"/><w:spacing w:before="100" w:after="100" w:line="240" w:lineRule="auto"/></w:pPr><w:r><w:rPr><w:rFonts w:ascii="Arial" w:hAnsi="Arial" w:cs="Arial"/><w:color w:val="000000"/><w:sz w:val="24"/><w:szCs w:val="24"/></w:rPr><w:t xml:space="preserve">• Intoxication Suspected (Alcohol/Drugs): </w:t></w:r><w:r><w:rPr><w:rFonts w:ascii="Arial" w:hAnsi="Arial" w:cs="Arial"/><w:b/><w:bCs/><w:color w:val="000000"/><w:sz w:val="24"/><w:szCs w:val="24"/></w:rPr><w:t xml:space="preserve">{intoxication_suspected}</w:t></w:r></w:p>
-<w:p><w:pPr><w:jc w:val="both"/><w:spacing w:before="100" w:after="100" w:line="240" w:lineRule="auto"/></w:pPr><w:r><w:rPr><w:rFonts w:ascii="Arial" w:hAnsi="Arial" w:cs="Arial"/><w:color w:val="000000"/><w:sz w:val="24"/><w:szCs w:val="24"/></w:rPr><w:t xml:space="preserve">• Event Description: </w:t></w:r><w:r><w:rPr><w:rFonts w:ascii="Arial" w:hAnsi="Arial" w:cs="Arial"/><w:color w:val="000000"/><w:sz w:val="24"/><w:szCs w:val="24"/></w:rPr><w:t xml:space="preserve">{how_happened}</w:t></w:r></w:p>
-<w:p><w:pPr><w:spacing w:after="100" w:line="240" w:lineRule="auto"/></w:pPr></w:p>
-
-<w:p><w:pPr><w:jc w:val="both"/><w:spacing w:before="100" w:after="100" w:line="240" w:lineRule="auto"/></w:pPr><w:r><w:rPr><w:rFonts w:ascii="Arial" w:hAnsi="Arial" w:cs="Arial"/><w:b/><w:bCs/><w:color w:val="000000"/><w:sz w:val="24"/><w:szCs w:val="24"/></w:rPr><w:t xml:space="preserve">3. Patient Assessment & Vital Signs:</w:t></w:r></w:p>
-<w:p><w:pPr><w:jc w:val="both"/><w:spacing w:before="100" w:after="100" w:line="240" w:lineRule="auto"/></w:pPr><w:r><w:rPr><w:rFonts w:ascii="Arial" w:hAnsi="Arial" w:cs="Arial"/><w:color w:val="000000"/><w:sz w:val="24"/><w:szCs w:val="24"/></w:rPr><w:t xml:space="preserve">• Observed Injuries / Complaints: </w:t></w:r><w:r><w:rPr><w:rFonts w:ascii="Arial" w:hAnsi="Arial" w:cs="Arial"/><w:b/><w:bCs/><w:color w:val="000000"/><w:sz w:val="24"/><w:szCs w:val="24"/></w:rPr><w:t xml:space="preserve">{injuries_observed}</w:t></w:r></w:p>
-<w:p><w:pPr><w:jc w:val="both"/><w:spacing w:before="100" w:after="100" w:line="240" w:lineRule="auto"/></w:pPr><w:r><w:rPr><w:rFonts w:ascii="Arial" w:hAnsi="Arial" w:cs="Arial"/><w:color w:val="000000"/><w:sz w:val="24"/><w:szCs w:val="24"/></w:rPr><w:t xml:space="preserve">• Consciousness (GCS): </w:t></w:r><w:r><w:rPr><w:rFonts w:ascii="Arial" w:hAnsi="Arial" w:cs="Arial"/><w:color w:val="000000"/><w:sz w:val="24"/><w:szCs w:val="24"/></w:rPr><w:t xml:space="preserve">{gcs_level}</w:t></w:r><w:r><w:rPr><w:rFonts w:ascii="Arial" w:hAnsi="Arial" w:cs="Arial"/><w:color w:val="000000"/><w:sz w:val="24"/><w:szCs w:val="24"/></w:rPr><w:t xml:space="preserve"> (Score: </w:t></w:r><w:r><w:rPr><w:rFonts w:ascii="Arial" w:hAnsi="Arial" w:cs="Arial"/><w:b/><w:bCs/><w:color w:val="000000"/><w:sz w:val="24"/><w:szCs w:val="24"/></w:rPr><w:t xml:space="preserve">{gcs_score}</w:t></w:r><w:r><w:rPr><w:rFonts w:ascii="Arial" w:hAnsi="Arial" w:cs="Arial"/><w:color w:val="000000"/><w:sz w:val="24"/><w:szCs w:val="24"/></w:rPr><w:t xml:space="preserve">)</w:t></w:r></w:p>
-<w:p><w:pPr><w:jc w:val="both"/><w:spacing w:before="100" w:after="100" w:line="240" w:lineRule="auto"/></w:pPr><w:r><w:rPr><w:rFonts w:ascii="Arial" w:hAnsi="Arial" w:cs="Arial"/><w:color w:val="000000"/><w:sz w:val="24"/><w:szCs w:val="24"/></w:rPr><w:t xml:space="preserve">• Airway: </w:t></w:r><w:r><w:rPr><w:rFonts w:ascii="Arial" w:hAnsi="Arial" w:cs="Arial"/><w:color w:val="000000"/><w:sz w:val="24"/><w:szCs w:val="24"/></w:rPr><w:t xml:space="preserve">{airway_status}</w:t></w:r><w:r><w:rPr><w:rFonts w:ascii="Arial" w:hAnsi="Arial" w:cs="Arial"/><w:color w:val="000000"/><w:sz w:val="24"/><w:szCs w:val="24"/></w:rPr><w:t xml:space="preserve">  |  Breathing: </w:t></w:r><w:r><w:rPr><w:rFonts w:ascii="Arial" w:hAnsi="Arial" w:cs="Arial"/><w:color w:val="000000"/><w:sz w:val="24"/><w:szCs w:val="24"/></w:rPr><w:t xml:space="preserve">{breathing_status}</w:t></w:r><w:r><w:rPr><w:rFonts w:ascii="Arial" w:hAnsi="Arial" w:cs="Arial"/><w:color w:val="000000"/><w:sz w:val="24"/><w:szCs w:val="24"/></w:rPr><w:t xml:space="preserve">  |  Circulation: </w:t></w:r><w:r><w:rPr><w:rFonts w:ascii="Arial" w:hAnsi="Arial" w:cs="Arial"/><w:color w:val="000000"/><w:sz w:val="24"/><w:szCs w:val="24"/></w:rPr><w:t xml:space="preserve">{circulation_status}</w:t></w:r></w:p>
-<w:p><w:pPr><w:jc w:val="both"/><w:spacing w:before="100" w:after="100" w:line="240" w:lineRule="auto"/></w:pPr><w:r><w:rPr><w:rFonts w:ascii="Arial" w:hAnsi="Arial" w:cs="Arial"/><w:color w:val="000000"/><w:sz w:val="24"/><w:szCs w:val="24"/></w:rPr><w:t xml:space="preserve">• Vital Signs: BP: </w:t></w:r><w:r><w:rPr><w:rFonts w:ascii="Arial" w:hAnsi="Arial" w:cs="Arial"/><w:b/><w:bCs/><w:color w:val="000000"/><w:sz w:val="24"/><w:szCs w:val="24"/></w:rPr><w:t xml:space="preserve">{bp}</w:t></w:r><w:r><w:rPr><w:rFonts w:ascii="Arial" w:hAnsi="Arial" w:cs="Arial"/><w:color w:val="000000"/><w:sz w:val="24"/><w:szCs w:val="24"/></w:rPr><w:t xml:space="preserve"> mmHg | Pulse: </w:t></w:r><w:r><w:rPr><w:rFonts w:ascii="Arial" w:hAnsi="Arial" w:cs="Arial"/><w:b/><w:bCs/><w:color w:val="000000"/><w:sz w:val="24"/><w:szCs w:val="24"/></w:rPr><w:t xml:space="preserve">{pulse}</w:t></w:r><w:r><w:rPr><w:rFonts w:ascii="Arial" w:hAnsi="Arial" w:cs="Arial"/><w:color w:val="000000"/><w:sz w:val="24"/><w:szCs w:val="24"/></w:rPr><w:t xml:space="preserve"> bpm | RR: </w:t></w:r><w:r><w:rPr><w:rFonts w:ascii="Arial" w:hAnsi="Arial" w:cs="Arial"/><w:b/><w:bCs/><w:color w:val="000000"/><w:sz w:val="24"/><w:szCs w:val="24"/></w:rPr><w:t xml:space="preserve">{rr}</w:t></w:r><w:r><w:rPr><w:rFonts w:ascii="Arial" w:hAnsi="Arial" w:cs="Arial"/><w:color w:val="000000"/><w:sz w:val="24"/><w:szCs w:val="24"/></w:rPr><w:t xml:space="preserve"> cpm | SaO₂: </w:t></w:r><w:r><w:rPr><w:rFonts w:ascii="Arial" w:hAnsi="Arial" w:cs="Arial"/><w:b/><w:bCs/><w:color w:val="000000"/><w:sz w:val="24"/><w:szCs w:val="24"/></w:rPr><w:t xml:space="preserve">{sao2}</w:t></w:r><w:r><w:rPr><w:rFonts w:ascii="Arial" w:hAnsi="Arial" w:cs="Arial"/><w:color w:val="000000"/><w:sz w:val="24"/><w:szCs w:val="24"/></w:rPr><w:t xml:space="preserve"> | Temp: </w:t></w:r><w:r><w:rPr><w:rFonts w:ascii="Arial" w:hAnsi="Arial" w:cs="Arial"/><w:b/><w:bCs/><w:color w:val="000000"/><w:sz w:val="24"/><w:szCs w:val="24"/></w:rPr><w:t xml:space="preserve">{temp}</w:t></w:r><w:r><w:rPr><w:rFonts w:ascii="Arial" w:hAnsi="Arial" w:cs="Arial"/><w:color w:val="000000"/><w:sz w:val="24"/><w:szCs w:val="24"/></w:rPr><w:t xml:space="preserve">°C</w:t></w:r></w:p>
-<w:p><w:pPr><w:spacing w:after="100" w:line="240" w:lineRule="auto"/></w:pPr></w:p>
-
-<w:p><w:pPr><w:jc w:val="both"/><w:spacing w:before="100" w:after="100" w:line="240" w:lineRule="auto"/></w:pPr><w:r><w:rPr><w:rFonts w:ascii="Arial" w:hAnsi="Arial" w:cs="Arial"/><w:b/><w:bCs/><w:color w:val="000000"/><w:sz w:val="24"/><w:szCs w:val="24"/></w:rPr><w:t xml:space="preserve">4. Pre-Hospital Care & Interventions:</w:t></w:r></w:p>
-<w:p><w:pPr><w:jc w:val="both"/><w:spacing w:before="100" w:after="100" w:line="240" w:lineRule="auto"/></w:pPr><w:r><w:rPr><w:rFonts w:ascii="Arial" w:hAnsi="Arial" w:cs="Arial"/><w:color w:val="000000"/><w:sz w:val="24"/><w:szCs w:val="24"/></w:rPr><w:t xml:space="preserve">• Interventions Provided: </w:t></w:r><w:r><w:rPr><w:rFonts w:ascii="Arial" w:hAnsi="Arial" w:cs="Arial"/><w:color w:val="000000"/><w:sz w:val="24"/><w:szCs w:val="24"/></w:rPr><w:t xml:space="preserve">{treatment}</w:t></w:r></w:p>
-<w:p><w:pPr><w:jc w:val="both"/><w:spacing w:before="100" w:after="100" w:line="240" w:lineRule="auto"/></w:pPr><w:r><w:rPr><w:rFonts w:ascii="Arial" w:hAnsi="Arial" w:cs="Arial"/><w:color w:val="000000"/><w:sz w:val="24"/><w:szCs w:val="24"/></w:rPr><w:t xml:space="preserve">• Bleeding Controlled: </w:t></w:r><w:r><w:rPr><w:rFonts w:ascii="Arial" w:hAnsi="Arial" w:cs="Arial"/><w:b/><w:bCs/><w:color w:val="000000"/><w:sz w:val="24"/><w:szCs w:val="24"/></w:rPr><w:t xml:space="preserve">{bleeding_controlled}</w:t></w:r><w:r><w:rPr><w:rFonts w:ascii="Arial" w:hAnsi="Arial" w:cs="Arial"/><w:color w:val="000000"/><w:sz w:val="24"/><w:szCs w:val="24"/></w:rPr><w:t xml:space="preserve">  |  Immobilized: </w:t></w:r><w:r><w:rPr><w:rFonts w:ascii="Arial" w:hAnsi="Arial" w:cs="Arial"/><w:b/><w:bCs/><w:color w:val="000000"/><w:sz w:val="24"/><w:szCs w:val="24"/></w:rPr><w:t xml:space="preserve">{immobilized}</w:t></w:r><w:r><w:rPr><w:rFonts w:ascii="Arial" w:hAnsi="Arial" w:cs="Arial"/><w:color w:val="000000"/><w:sz w:val="24"/><w:szCs w:val="24"/></w:rPr><w:t xml:space="preserve">  |  Wounds Cleaned: </w:t></w:r><w:r><w:rPr><w:rFonts w:ascii="Arial" w:hAnsi="Arial" w:cs="Arial"/><w:b/><w:bCs/><w:color w:val="000000"/><w:sz w:val="24"/><w:szCs w:val="24"/></w:rPr><w:t xml:space="preserve">{wounds_cleaned}</w:t></w:r><w:r><w:rPr><w:rFonts w:ascii="Arial" w:hAnsi="Arial" w:cs="Arial"/><w:color w:val="000000"/><w:sz w:val="24"/><w:szCs w:val="24"/></w:rPr><w:t xml:space="preserve">  |  Oxygen Administered: </w:t></w:r><w:r><w:rPr><w:rFonts w:ascii="Arial" w:hAnsi="Arial" w:cs="Arial"/><w:b/><w:bCs/><w:color w:val="000000"/><w:sz w:val="24"/><w:szCs w:val="24"/></w:rPr><w:t xml:space="preserve">{oxygen_administered}</w:t></w:r></w:p>
-<w:p><w:pPr><w:spacing w:after="100" w:line="240" w:lineRule="auto"/></w:pPr></w:p>
-
-<w:p><w:pPr><w:jc w:val="both"/><w:spacing w:before="100" w:after="100" w:line="240" w:lineRule="auto"/></w:pPr><w:r><w:rPr><w:rFonts w:ascii="Arial" w:hAnsi="Arial" w:cs="Arial"/><w:b/><w:bCs/><w:color w:val="000000"/><w:sz w:val="24"/><w:szCs w:val="24"/></w:rPr><w:t xml:space="preserve">5. Response & Patient Disposition:</w:t></w:r></w:p>
-<w:p><w:pPr><w:jc w:val="both"/><w:spacing w:before="100" w:after="100" w:line="240" w:lineRule="auto"/></w:pPr><w:r><w:rPr><w:rFonts w:ascii="Arial" w:hAnsi="Arial" w:cs="Arial"/><w:color w:val="000000"/><w:sz w:val="24"/><w:szCs w:val="24"/></w:rPr><w:t xml:space="preserve">• Responding Agency: </w:t></w:r><w:r><w:rPr><w:rFonts w:ascii="Arial" w:hAnsi="Arial" w:cs="Arial"/><w:b/><w:bCs/><w:color w:val="000000"/><w:sz w:val="24"/><w:szCs w:val="24"/></w:rPr><w:t xml:space="preserve">{responding_agency}</w:t></w:r><w:r><w:rPr><w:rFonts w:ascii="Arial" w:hAnsi="Arial" w:cs="Arial"/><w:color w:val="000000"/><w:sz w:val="24"/><w:szCs w:val="24"/></w:rPr><w:t xml:space="preserve"> | Responders: </w:t></w:r><w:r><w:rPr><w:rFonts w:ascii="Arial" w:hAnsi="Arial" w:cs="Arial"/><w:color w:val="000000"/><w:sz w:val="24"/><w:szCs w:val="24"/></w:rPr><w:t xml:space="preserve">{responder_names}</w:t></w:r></w:p>
-<w:p><w:pPr><w:jc w:val="both"/><w:spacing w:before="100" w:after="100" w:line="240" w:lineRule="auto"/></w:pPr><w:r><w:rPr><w:rFonts w:ascii="Arial" w:hAnsi="Arial" w:cs="Arial"/><w:color w:val="000000"/><w:sz w:val="24"/><w:szCs w:val="24"/></w:rPr><w:t xml:space="preserve">• Arrival Time: </w:t></w:r><w:r><w:rPr><w:rFonts w:ascii="Arial" w:hAnsi="Arial" w:cs="Arial"/><w:color w:val="000000"/><w:sz w:val="24"/><w:szCs w:val="24"/></w:rPr><w:t xml:space="preserve">{arrival_time}</w:t></w:r><w:r><w:rPr><w:rFonts w:ascii="Arial" w:hAnsi="Arial" w:cs="Arial"/><w:color w:val="000000"/><w:sz w:val="24"/><w:szCs w:val="24"/></w:rPr><w:t xml:space="preserve"> | Departure Time: </w:t></w:r><w:r><w:rPr><w:rFonts w:ascii="Arial" w:hAnsi="Arial" w:cs="Arial"/><w:color w:val="000000"/><w:sz w:val="24"/><w:szCs w:val="24"/></w:rPr><w:t xml:space="preserve">{departure_time}</w:t></w:r></w:p>
-<w:p><w:pPr><w:jc w:val="both"/><w:spacing w:before="100" w:after="100" w:line="240" w:lineRule="auto"/></w:pPr><w:r><w:rPr><w:rFonts w:ascii="Arial" w:hAnsi="Arial" w:cs="Arial"/><w:color w:val="000000"/><w:sz w:val="24"/><w:szCs w:val="24"/></w:rPr><w:t xml:space="preserve">• Disposition Status: </w:t></w:r><w:r><w:rPr><w:rFonts w:ascii="Arial" w:hAnsi="Arial" w:cs="Arial"/><w:b/><w:bCs/><w:color w:val="000000"/><w:sz w:val="24"/><w:szCs w:val="24"/></w:rPr><w:t xml:space="preserve">{disposition_status}</w:t></w:r></w:p>
-<w:p><w:pPr><w:jc w:val="both"/><w:spacing w:before="100" w:after="100" w:line="240" w:lineRule="auto"/></w:pPr><w:r><w:rPr><w:rFonts w:ascii="Arial" w:hAnsi="Arial" w:cs="Arial"/><w:color w:val="000000"/><w:sz w:val="24"/><w:szCs w:val="24"/></w:rPr><w:t xml:space="preserve">• Destination Facility: </w:t></w:r><w:r><w:rPr><w:rFonts w:ascii="Arial" w:hAnsi="Arial" w:cs="Arial"/><w:b/><w:bCs/><w:color w:val="000000"/><w:sz w:val="24"/><w:szCs w:val="24"/></w:rPr><w:t xml:space="preserve">{destination_facility}</w:t></w:r><w:r><w:rPr><w:rFonts w:ascii="Arial" w:hAnsi="Arial" w:cs="Arial"/><w:color w:val="000000"/><w:sz w:val="24"/><w:szCs w:val="24"/></w:rPr><w:t xml:space="preserve"> | Transport Time: </w:t></w:r><w:r><w:rPr><w:rFonts w:ascii="Arial" w:hAnsi="Arial" w:cs="Arial"/><w:color w:val="000000"/><w:sz w:val="24"/><w:szCs w:val="24"/></w:rPr><w:t xml:space="preserve">{transport_time}</w:t></w:r></w:p>
-<w:p><w:pPr><w:jc w:val="both"/><w:spacing w:before="100" w:after="100" w:line="240" w:lineRule="auto"/></w:pPr><w:r><w:rPr><w:rFonts w:ascii="Arial" w:hAnsi="Arial" w:cs="Arial"/><w:color w:val="000000"/><w:sz w:val="24"/><w:szCs w:val="24"/></w:rPr><w:t xml:space="preserve">• Status Upon Turnover: </w:t></w:r><w:r><w:rPr><w:rFonts w:ascii="Arial" w:hAnsi="Arial" w:cs="Arial"/><w:color w:val="000000"/><w:sz w:val="24"/><w:szCs w:val="24"/></w:rPr><w:t xml:space="preserve">{turnover_status}</w:t></w:r></w:p>
-<w:p><w:pPr><w:spacing w:after="100" w:line="240" w:lineRule="auto"/></w:pPr></w:p>
-
-<w:p><w:pPr><w:jc w:val="both"/><w:spacing w:before="100" w:after="100" w:line="240" w:lineRule="auto"/></w:pPr><w:r><w:rPr><w:rFonts w:ascii="Arial" w:hAnsi="Arial" w:cs="Arial"/><w:color w:val="000000"/><w:sz w:val="24"/><w:szCs w:val="24"/></w:rPr><w:t xml:space="preserve">{procedure_photo_note}</w:t></w:r></w:p>
-<w:p><w:pPr><w:spacing w:after="100" w:line="240" w:lineRule="auto"/></w:pPr></w:p>
-
-<w:p>
-  <w:pPr><w:jc w:val="center"/><w:spacing w:before="240" w:after="240"/></w:pPr>
-  <w:r>
-    <w:drawing>
-      <wp:inline distT="0" distB="0" distL="0" distR="0"
-                 xmlns:wp="http://schemas.openxmlformats.org/drawingml/2006/wordprocessingDrawing"
-                 xmlns:a="http://schemas.openxmlformats.org/drawingml/2006/main"
-                 xmlns:pic="http://schemas.openxmlformats.org/drawingml/2006/picture"
-                 xmlns:r="http://schemas.openxmlformats.org/officeDocument/2006/relationships">
-        <wp:extent cx="5400000" cy="1800000"/>
-        <wp:docPr id="1001" name="Signature Block 1001"/>
-        <a:graphic>
-          <a:graphicData uri="http://schemas.openxmlformats.org/drawingml/2006/main">
-            <pic:pic>
-              <pic:nvPicPr>
-                <pic:cNvPr id="1001" name="signature_block.png"/>
-                <pic:cNvPicPr/>
-              </pic:nvPicPr>
-              <pic:blipFill>
-                <a:blip r:embed="rIdSig"/>
-                <a:stretch><a:fillRect/></a:stretch>
-              </pic:blipFill>
-              <pic:spPr>
-                <a:xfrm><a:off x="0" y="0"/><a:ext cx="5400000" cy="1800000"/></a:xfrm>
-                <a:prstGeom prst="rect"><a:avLst/></a:prstGeom>
-              </pic:spPr>
-            </pic:pic>
-          </a:graphicData>
-        </a:graphic>
-      </wp:inline>
-    </w:drawing>
-  </w:r>
-</w:p>
-
-<w:p><w:pPr><w:spacing w:after="100" w:line="240" w:lineRule="auto"/></w:pPr><w:r><w:rPr><w:rFonts w:ascii="Arial" w:hAnsi="Arial" w:cs="Arial"/><w:color w:val="000000"/><w:sz w:val="24"/><w:szCs w:val="24"/></w:rPr><w:t xml:space="preserve">{/incidents}</w:t></w:r></w:p>
-<w:sectPr><w:headerReference w:type="default" r:id="rId82"/><w:footerReference w:type="default" r:id="rId83"/><w:pgSz w:w="12240" w:h="18720" w:code="14"/><w:pgMar w:top="1440" w:right="1440" w:bottom="1440" w:left="1440" w:header="708" w:footer="708" w:gutter="0"/><w:cols w:space="708"/><w:docGrid w:linePitch="360"/></w:sectPr></w:body></w:document>
+<file path=word/document.xml><?xml version="1.0" encoding="utf-8"?>
+<w:document xmlns:pic="http://schemas.openxmlformats.org/drawingml/2006/picture" xmlns:a="http://schemas.openxmlformats.org/drawingml/2006/main" xmlns:wpc="http://schemas.microsoft.com/office/word/2010/wordprocessingCanvas" xmlns:cx="http://schemas.microsoft.com/office/drawing/2014/chartex" xmlns:cx1="http://schemas.microsoft.com/office/drawing/2015/9/8/chartex" xmlns:cx2="http://schemas.microsoft.com/office/drawing/2015/10/21/chartex" xmlns:cx3="http://schemas.microsoft.com/office/drawing/2016/5/9/chartex" xmlns:cx4="http://schemas.microsoft.com/office/drawing/2016/5/10/chartex" xmlns:cx5="http://schemas.microsoft.com/office/drawing/2016/5/11/chartex" xmlns:cx6="http://schemas.microsoft.com/office/drawing/2016/5/12/chartex" xmlns:cx7="http://schemas.microsoft.com/office/drawing/2016/5/13/chartex" xmlns:cx8="http://schemas.microsoft.com/office/drawing/2016/5/14/chartex" xmlns:mc="http://schemas.openxmlformats.org/markup-compatibility/2006" xmlns:aink="http://schemas.microsoft.com/office/drawing/2016/ink" xmlns:am3d="http://schemas.microsoft.com/office/drawing/2017/model3d" xmlns:o="urn:schemas-microsoft-com:office:office" xmlns:r="http://schemas.openxmlformats.org/officeDocument/2006/relationships" xmlns:m="http://schemas.openxmlformats.org/officeDocument/2006/math" xmlns:v="urn:schemas-microsoft-com:vml" xmlns:wp14="http://schemas.microsoft.com/office/word/2010/wordprocessingDrawing" xmlns:wp="http://schemas.openxmlformats.org/drawingml/2006/wordprocessingDrawing" xmlns:w10="urn:schemas-microsoft-com:office:word" xmlns:w="http://schemas.openxmlformats.org/wordprocessingml/2006/main" xmlns:w14="http://schemas.microsoft.com/office/word/2010/wordml" xmlns:w15="http://schemas.microsoft.com/office/word/2012/wordml" xmlns:w16cex="http://schemas.microsoft.com/office/word/2018/wordml/cex" xmlns:w16cid="http://schemas.microsoft.com/office/word/2016/wordml/cid" xmlns:w16="http://schemas.microsoft.com/office/word/2018/wordml" xmlns:w16sdtdh="http://schemas.microsoft.com/office/word/2020/wordml/sdtdatahash" xmlns:w16se="http://schemas.microsoft.com/office/word/2015/wordml/symex" xmlns:wpg="http://schemas.microsoft.com/office/word/2010/wordprocessingGroup" xmlns:wpi="http://schemas.microsoft.com/office/word/2010/wordprocessingInk" xmlns:wne="http://schemas.microsoft.com/office/word/2006/wordml" xmlns:wps="http://schemas.microsoft.com/office/word/2010/wordprocessingShape" mc:Ignorable="w14 w15 w16se w16cid w16 w16cex w16sdtdh wp14">
+  <w:body>
+    <w:p>
+      <w:pPr>
+        <w:spacing w:after="100" w:line="240" w:lineRule="auto"/>
+      </w:pPr>
+      <w:r>
+        <w:rPr>
+          <w:rFonts w:ascii="Arial" w:hAnsi="Arial" w:cs="Arial"/>
+          <w:color w:val="000000"/>
+          <w:sz w:val="24"/>
+          <w:szCs w:val="24"/>
+        </w:rPr>
+        <w:t xml:space="preserve">{#incidents}</w:t>
+      </w:r>
+    </w:p>
+    <w:p>
+      <w:pPr>
+        <w:jc w:val="center"/>
+        <w:spacing w:before="120" w:after="120" w:line="240" w:lineRule="auto"/>
+      </w:pPr>
+      <w:r>
+        <w:rPr>
+          <w:rFonts w:ascii="Arial" w:hAnsi="Arial" w:cs="Arial"/>
+          <w:b/>
+          <w:bCs/>
+          <w:color w:val="000000"/>
+          <w:sz w:val="24"/>
+          <w:szCs w:val="24"/>
+        </w:rPr>
+        <w:t xml:space="preserve">INCIDENT REPORT</w:t>
+      </w:r>
+    </w:p>
+    <w:p>
+      <w:pPr>
+        <w:spacing w:after="100" w:line="240" w:lineRule="auto"/>
+      </w:pPr>
+    </w:p>
+    <w:p>
+      <w:pPr>
+        <w:jc w:val="both"/>
+        <w:spacing w:before="100" w:after="100" w:line="240" w:lineRule="auto"/>
+      </w:pPr>
+      <w:r>
+        <w:rPr>
+          <w:rFonts w:ascii="Arial" w:hAnsi="Arial" w:cs="Arial"/>
+          <w:color w:val="000000"/>
+          <w:sz w:val="24"/>
+          <w:szCs w:val="24"/>
+        </w:rPr>
+        <w:t xml:space="preserve">       That on or about </w:t>
+      </w:r>
+      <w:r>
+        <w:rPr>
+          <w:rFonts w:ascii="Arial" w:hAnsi="Arial" w:cs="Arial"/>
+          <w:b/>
+          <w:bCs/>
+          <w:color w:val="000000"/>
+          <w:sz w:val="24"/>
+          <w:szCs w:val="24"/>
+        </w:rPr>
+        <w:t xml:space="preserve">{time}</w:t>
+      </w:r>
+      <w:r>
+        <w:rPr>
+          <w:rFonts w:ascii="Arial" w:hAnsi="Arial" w:cs="Arial"/>
+          <w:color w:val="000000"/>
+          <w:sz w:val="24"/>
+          <w:szCs w:val="24"/>
+        </w:rPr>
+        <w:t xml:space="preserve"> of </w:t>
+      </w:r>
+      <w:r>
+        <w:rPr>
+          <w:rFonts w:ascii="Arial" w:hAnsi="Arial" w:cs="Arial"/>
+          <w:b/>
+          <w:bCs/>
+          <w:color w:val="000000"/>
+          <w:sz w:val="24"/>
+          <w:szCs w:val="24"/>
+        </w:rPr>
+        <w:t xml:space="preserve">{date}</w:t>
+      </w:r>
+      <w:r>
+        <w:rPr>
+          <w:rFonts w:ascii="Arial" w:hAnsi="Arial" w:cs="Arial"/>
+          <w:color w:val="000000"/>
+          <w:sz w:val="24"/>
+          <w:szCs w:val="24"/>
+        </w:rPr>
+        <w:t xml:space="preserve">, a </w:t>
+      </w:r>
+      <w:r>
+        <w:rPr>
+          <w:rFonts w:ascii="Arial" w:hAnsi="Arial" w:cs="Arial"/>
+          <w:b/>
+          <w:bCs/>
+          <w:color w:val="000000"/>
+          <w:sz w:val="24"/>
+          <w:szCs w:val="24"/>
+        </w:rPr>
+        <w:t xml:space="preserve">{incident_type}</w:t>
+      </w:r>
+      <w:r>
+        <w:rPr>
+          <w:rFonts w:ascii="Arial" w:hAnsi="Arial" w:cs="Arial"/>
+          <w:color w:val="000000"/>
+          <w:sz w:val="24"/>
+          <w:szCs w:val="24"/>
+        </w:rPr>
+        <w:t xml:space="preserve"> occurred at </w:t>
+      </w:r>
+      <w:r>
+        <w:rPr>
+          <w:rFonts w:ascii="Arial" w:hAnsi="Arial" w:cs="Arial"/>
+          <w:b/>
+          <w:bCs/>
+          <w:color w:val="000000"/>
+          <w:sz w:val="24"/>
+          <w:szCs w:val="24"/>
+        </w:rPr>
+        <w:t xml:space="preserve">{location}.</w:t>
+      </w:r>
+    </w:p>
+    <w:p>
+      <w:pPr>
+        <w:jc w:val="both"/>
+        <w:spacing w:before="100" w:after="100" w:line="240" w:lineRule="auto"/>
+      </w:pPr>
+      <w:r>
+        <w:rPr>
+          <w:rFonts w:ascii="Arial" w:hAnsi="Arial" w:cs="Arial"/>
+          <w:color w:val="000000"/>
+          <w:sz w:val="24"/>
+          <w:szCs w:val="24"/>
+        </w:rPr>
+        <w:t xml:space="preserve">       That the incident was reported by </w:t>
+      </w:r>
+      <w:r>
+        <w:rPr>
+          <w:rFonts w:ascii="Arial" w:hAnsi="Arial" w:cs="Arial"/>
+          <w:b/>
+          <w:bCs/>
+          <w:color w:val="000000"/>
+          <w:sz w:val="24"/>
+          <w:szCs w:val="24"/>
+        </w:rPr>
+        <w:t xml:space="preserve">{reporter_name}</w:t>
+      </w:r>
+      <w:r>
+        <w:rPr>
+          <w:rFonts w:ascii="Arial" w:hAnsi="Arial" w:cs="Arial"/>
+          <w:color w:val="000000"/>
+          <w:sz w:val="24"/>
+          <w:szCs w:val="24"/>
+        </w:rPr>
+        <w:t xml:space="preserve">{reporter_phone}. {narrative}</w:t>
+      </w:r>
+    </w:p>
+    <w:p>
+      <w:pPr>
+        <w:jc w:val="both"/>
+        <w:spacing w:before="100" w:after="100" w:line="240" w:lineRule="auto"/>
+      </w:pPr>
+      <w:r>
+        <w:rPr>
+          <w:rFonts w:ascii="Arial" w:hAnsi="Arial" w:cs="Arial"/>
+          <w:color w:val="000000"/>
+          <w:sz w:val="24"/>
+          <w:szCs w:val="24"/>
+        </w:rPr>
+        <w:t xml:space="preserve">       That the Municipal Disaster Risk Reduction and Management Office (</w:t>
+      </w:r>
+      <w:r>
+        <w:rPr>
+          <w:rFonts w:ascii="Arial" w:hAnsi="Arial" w:cs="Arial"/>
+          <w:b/>
+          <w:bCs/>
+          <w:color w:val="000000"/>
+          <w:sz w:val="24"/>
+          <w:szCs w:val="24"/>
+        </w:rPr>
+        <w:t xml:space="preserve">MDRRMO</w:t>
+      </w:r>
+      <w:r>
+        <w:rPr>
+          <w:rFonts w:ascii="Arial" w:hAnsi="Arial" w:cs="Arial"/>
+          <w:color w:val="000000"/>
+          <w:sz w:val="24"/>
+          <w:szCs w:val="24"/>
+        </w:rPr>
+        <w:t xml:space="preserve">) emergency responders immediately responded to the scene to assess the situation and provide proper care management in accordance with standard operating procedures.</w:t>
+      </w:r>
+    </w:p>
+    <w:p>
+      <w:pPr>
+        <w:spacing w:after="100" w:line="240" w:lineRule="auto"/>
+      </w:pPr>
+    </w:p>
+    <w:p>
+      <w:pPr>
+        <w:jc w:val="both"/>
+        <w:spacing w:before="100" w:after="100" w:line="240" w:lineRule="auto"/>
+      </w:pPr>
+      <w:r>
+        <w:rPr>
+          <w:rFonts w:ascii="Arial" w:hAnsi="Arial" w:cs="Arial"/>
+          <w:b/>
+          <w:bCs/>
+          <w:color w:val="1E293B"/>
+          <w:sz w:val="26"/>
+          <w:szCs w:val="26"/>
+        </w:rPr>
+        <w:t xml:space="preserve">INCIDENT RESOLUTION &amp; QUESTIONNAIRE DETAILS</w:t>
+      </w:r>
+    </w:p>
+    <w:p>
+      <w:pPr>
+        <w:spacing w:after="100" w:line="240" w:lineRule="auto"/>
+      </w:pPr>
+    </w:p>
+    <w:p>
+      <w:pPr>
+        <w:jc w:val="both"/>
+        <w:spacing w:before="100" w:after="100" w:line="240" w:lineRule="auto"/>
+      </w:pPr>
+      <w:r>
+        <w:rPr>
+          <w:rFonts w:ascii="Arial" w:hAnsi="Arial" w:cs="Arial"/>
+          <w:b/>
+          <w:bCs/>
+          <w:color w:val="000000"/>
+          <w:sz w:val="24"/>
+          <w:szCs w:val="24"/>
+        </w:rPr>
+        <w:t xml:space="preserve">1. Patient Information:</w:t>
+      </w:r>
+    </w:p>
+    <w:p>
+      <w:pPr>
+        <w:jc w:val="both"/>
+        <w:spacing w:before="100" w:after="100" w:line="240" w:lineRule="auto"/>
+      </w:pPr>
+      <w:r>
+        <w:rPr>
+          <w:rFonts w:ascii="Arial" w:hAnsi="Arial" w:cs="Arial"/>
+          <w:color w:val="000000"/>
+          <w:sz w:val="24"/>
+          <w:szCs w:val="24"/>
+        </w:rPr>
+        <w:t xml:space="preserve">• Name: </w:t>
+      </w:r>
+      <w:r>
+        <w:rPr>
+          <w:rFonts w:ascii="Arial" w:hAnsi="Arial" w:cs="Arial"/>
+          <w:b/>
+          <w:bCs/>
+          <w:color w:val="000000"/>
+          <w:sz w:val="24"/>
+          <w:szCs w:val="24"/>
+        </w:rPr>
+        <w:t xml:space="preserve">{patient_name}</w:t>
+      </w:r>
+      <w:r>
+        <w:rPr>
+          <w:rFonts w:ascii="Arial" w:hAnsi="Arial" w:cs="Arial"/>
+          <w:color w:val="000000"/>
+          <w:sz w:val="24"/>
+          <w:szCs w:val="24"/>
+        </w:rPr>
+        <w:t xml:space="preserve">  |  Age: </w:t>
+      </w:r>
+      <w:r>
+        <w:rPr>
+          <w:rFonts w:ascii="Arial" w:hAnsi="Arial" w:cs="Arial"/>
+          <w:b/>
+          <w:bCs/>
+          <w:color w:val="000000"/>
+          <w:sz w:val="24"/>
+          <w:szCs w:val="24"/>
+        </w:rPr>
+        <w:t xml:space="preserve">{patient_age}</w:t>
+      </w:r>
+      <w:r>
+        <w:rPr>
+          <w:rFonts w:ascii="Arial" w:hAnsi="Arial" w:cs="Arial"/>
+          <w:color w:val="000000"/>
+          <w:sz w:val="24"/>
+          <w:szCs w:val="24"/>
+        </w:rPr>
+        <w:t xml:space="preserve">  |  Sex: </w:t>
+      </w:r>
+      <w:r>
+        <w:rPr>
+          <w:rFonts w:ascii="Arial" w:hAnsi="Arial" w:cs="Arial"/>
+          <w:b/>
+          <w:bCs/>
+          <w:color w:val="000000"/>
+          <w:sz w:val="24"/>
+          <w:szCs w:val="24"/>
+        </w:rPr>
+        <w:t xml:space="preserve">{patient_sex}</w:t>
+      </w:r>
+    </w:p>
+    <w:p>
+      <w:pPr>
+        <w:jc w:val="both"/>
+        <w:spacing w:before="100" w:after="100" w:line="240" w:lineRule="auto"/>
+      </w:pPr>
+      <w:r>
+        <w:rPr>
+          <w:rFonts w:ascii="Arial" w:hAnsi="Arial" w:cs="Arial"/>
+          <w:color w:val="000000"/>
+          <w:sz w:val="24"/>
+          <w:szCs w:val="24"/>
+        </w:rPr>
+        <w:t xml:space="preserve">• Address: </w:t>
+      </w:r>
+      <w:r>
+        <w:rPr>
+          <w:rFonts w:ascii="Arial" w:hAnsi="Arial" w:cs="Arial"/>
+          <w:color w:val="000000"/>
+          <w:sz w:val="24"/>
+          <w:szCs w:val="24"/>
+        </w:rPr>
+        <w:t xml:space="preserve">{patient_address}</w:t>
+      </w:r>
+    </w:p>
+    <w:p>
+      <w:pPr>
+        <w:spacing w:after="100" w:line="240" w:lineRule="auto"/>
+      </w:pPr>
+    </w:p>
+    <w:p>
+      <w:pPr>
+        <w:jc w:val="both"/>
+        <w:spacing w:before="100" w:after="100" w:line="240" w:lineRule="auto"/>
+      </w:pPr>
+      <w:r>
+        <w:rPr>
+          <w:rFonts w:ascii="Arial" w:hAnsi="Arial" w:cs="Arial"/>
+          <w:b/>
+          <w:bCs/>
+          <w:color w:val="000000"/>
+          <w:sz w:val="24"/>
+          <w:szCs w:val="24"/>
+        </w:rPr>
+        <w:t xml:space="preserve">2. Incident Cause &amp; Mechanism:</w:t>
+      </w:r>
+    </w:p>
+    <w:p>
+      <w:pPr>
+        <w:jc w:val="both"/>
+        <w:spacing w:before="100" w:after="100" w:line="240" w:lineRule="auto"/>
+      </w:pPr>
+      <w:r>
+        <w:rPr>
+          <w:rFonts w:ascii="Arial" w:hAnsi="Arial" w:cs="Arial"/>
+          <w:color w:val="000000"/>
+          <w:sz w:val="24"/>
+          <w:szCs w:val="24"/>
+        </w:rPr>
+        <w:t xml:space="preserve">• Mechanism of Injury / Cause: </w:t>
+      </w:r>
+      <w:r>
+        <w:rPr>
+          <w:rFonts w:ascii="Arial" w:hAnsi="Arial" w:cs="Arial"/>
+          <w:b/>
+          <w:bCs/>
+          <w:color w:val="000000"/>
+          <w:sz w:val="24"/>
+          <w:szCs w:val="24"/>
+        </w:rPr>
+        <w:t xml:space="preserve">{mechanism_of_injury}</w:t>
+      </w:r>
+    </w:p>
+    <w:p>
+      <w:pPr>
+        <w:jc w:val="both"/>
+        <w:spacing w:before="100" w:after="100" w:line="240" w:lineRule="auto"/>
+      </w:pPr>
+      <w:r>
+        <w:rPr>
+          <w:rFonts w:ascii="Arial" w:hAnsi="Arial" w:cs="Arial"/>
+          <w:color w:val="000000"/>
+          <w:sz w:val="24"/>
+          <w:szCs w:val="24"/>
+        </w:rPr>
+        <w:t xml:space="preserve">• Intoxication Suspected (Alcohol/Drugs): </w:t>
+      </w:r>
+      <w:r>
+        <w:rPr>
+          <w:rFonts w:ascii="Arial" w:hAnsi="Arial" w:cs="Arial"/>
+          <w:b/>
+          <w:bCs/>
+          <w:color w:val="000000"/>
+          <w:sz w:val="24"/>
+          <w:szCs w:val="24"/>
+        </w:rPr>
+        <w:t xml:space="preserve">{intoxication_suspected}</w:t>
+      </w:r>
+    </w:p>
+    <w:p>
+      <w:pPr>
+        <w:jc w:val="both"/>
+        <w:spacing w:before="100" w:after="100" w:line="240" w:lineRule="auto"/>
+      </w:pPr>
+      <w:r>
+        <w:rPr>
+          <w:rFonts w:ascii="Arial" w:hAnsi="Arial" w:cs="Arial"/>
+          <w:color w:val="000000"/>
+          <w:sz w:val="24"/>
+          <w:szCs w:val="24"/>
+        </w:rPr>
+        <w:t xml:space="preserve">• Event Description: </w:t>
+      </w:r>
+      <w:r>
+        <w:rPr>
+          <w:rFonts w:ascii="Arial" w:hAnsi="Arial" w:cs="Arial"/>
+          <w:color w:val="000000"/>
+          <w:sz w:val="24"/>
+          <w:szCs w:val="24"/>
+        </w:rPr>
+        <w:t xml:space="preserve">{how_happened}</w:t>
+      </w:r>
+    </w:p>
+    <w:p>
+      <w:pPr>
+        <w:spacing w:after="100" w:line="240" w:lineRule="auto"/>
+      </w:pPr>
+    </w:p>
+    <w:p>
+      <w:pPr>
+        <w:jc w:val="both"/>
+        <w:spacing w:before="100" w:after="100" w:line="240" w:lineRule="auto"/>
+      </w:pPr>
+      <w:r>
+        <w:rPr>
+          <w:rFonts w:ascii="Arial" w:hAnsi="Arial" w:cs="Arial"/>
+          <w:b/>
+          <w:bCs/>
+          <w:color w:val="000000"/>
+          <w:sz w:val="24"/>
+          <w:szCs w:val="24"/>
+        </w:rPr>
+        <w:t xml:space="preserve">3. Patient Assessment &amp; Vital Signs:</w:t>
+      </w:r>
+    </w:p>
+    <w:p>
+      <w:pPr>
+        <w:jc w:val="both"/>
+        <w:spacing w:before="100" w:after="100" w:line="240" w:lineRule="auto"/>
+      </w:pPr>
+      <w:r>
+        <w:rPr>
+          <w:rFonts w:ascii="Arial" w:hAnsi="Arial" w:cs="Arial"/>
+          <w:color w:val="000000"/>
+          <w:sz w:val="24"/>
+          <w:szCs w:val="24"/>
+        </w:rPr>
+        <w:t xml:space="preserve">• Observed Injuries / Complaints: </w:t>
+      </w:r>
+      <w:r>
+        <w:rPr>
+          <w:rFonts w:ascii="Arial" w:hAnsi="Arial" w:cs="Arial"/>
+          <w:b/>
+          <w:bCs/>
+          <w:color w:val="000000"/>
+          <w:sz w:val="24"/>
+          <w:szCs w:val="24"/>
+        </w:rPr>
+        <w:t xml:space="preserve">{injuries_observed}</w:t>
+      </w:r>
+    </w:p>
+    <w:p>
+      <w:pPr>
+        <w:jc w:val="both"/>
+        <w:spacing w:before="100" w:after="100" w:line="240" w:lineRule="auto"/>
+      </w:pPr>
+      <w:r>
+        <w:rPr>
+          <w:rFonts w:ascii="Arial" w:hAnsi="Arial" w:cs="Arial"/>
+          <w:color w:val="000000"/>
+          <w:sz w:val="24"/>
+          <w:szCs w:val="24"/>
+        </w:rPr>
+        <w:t xml:space="preserve">• Consciousness (GCS): </w:t>
+      </w:r>
+      <w:r>
+        <w:rPr>
+          <w:rFonts w:ascii="Arial" w:hAnsi="Arial" w:cs="Arial"/>
+          <w:color w:val="000000"/>
+          <w:sz w:val="24"/>
+          <w:szCs w:val="24"/>
+        </w:rPr>
+        <w:t xml:space="preserve">{gcs_level}</w:t>
+      </w:r>
+      <w:r>
+        <w:rPr>
+          <w:rFonts w:ascii="Arial" w:hAnsi="Arial" w:cs="Arial"/>
+          <w:color w:val="000000"/>
+          <w:sz w:val="24"/>
+          <w:szCs w:val="24"/>
+        </w:rPr>
+        <w:t xml:space="preserve"> (Score: </w:t>
+      </w:r>
+      <w:r>
+        <w:rPr>
+          <w:rFonts w:ascii="Arial" w:hAnsi="Arial" w:cs="Arial"/>
+          <w:b/>
+          <w:bCs/>
+          <w:color w:val="000000"/>
+          <w:sz w:val="24"/>
+          <w:szCs w:val="24"/>
+        </w:rPr>
+        <w:t xml:space="preserve">{gcs_score}</w:t>
+      </w:r>
+      <w:r>
+        <w:rPr>
+          <w:rFonts w:ascii="Arial" w:hAnsi="Arial" w:cs="Arial"/>
+          <w:color w:val="000000"/>
+          <w:sz w:val="24"/>
+          <w:szCs w:val="24"/>
+        </w:rPr>
+        <w:t xml:space="preserve">)</w:t>
+      </w:r>
+    </w:p>
+    <w:p>
+      <w:pPr>
+        <w:jc w:val="both"/>
+        <w:spacing w:before="100" w:after="100" w:line="240" w:lineRule="auto"/>
+      </w:pPr>
+      <w:r>
+        <w:rPr>
+          <w:rFonts w:ascii="Arial" w:hAnsi="Arial" w:cs="Arial"/>
+          <w:color w:val="000000"/>
+          <w:sz w:val="24"/>
+          <w:szCs w:val="24"/>
+        </w:rPr>
+        <w:t xml:space="preserve">• Airway: </w:t>
+      </w:r>
+      <w:r>
+        <w:rPr>
+          <w:rFonts w:ascii="Arial" w:hAnsi="Arial" w:cs="Arial"/>
+          <w:color w:val="000000"/>
+          <w:sz w:val="24"/>
+          <w:szCs w:val="24"/>
+        </w:rPr>
+        <w:t xml:space="preserve">{airway_status}</w:t>
+      </w:r>
+      <w:r>
+        <w:rPr>
+          <w:rFonts w:ascii="Arial" w:hAnsi="Arial" w:cs="Arial"/>
+          <w:color w:val="000000"/>
+          <w:sz w:val="24"/>
+          <w:szCs w:val="24"/>
+        </w:rPr>
+        <w:t xml:space="preserve">  |  Breathing: </w:t>
+      </w:r>
+      <w:r>
+        <w:rPr>
+          <w:rFonts w:ascii="Arial" w:hAnsi="Arial" w:cs="Arial"/>
+          <w:color w:val="000000"/>
+          <w:sz w:val="24"/>
+          <w:szCs w:val="24"/>
+        </w:rPr>
+        <w:t xml:space="preserve">{breathing_status}</w:t>
+      </w:r>
+      <w:r>
+        <w:rPr>
+          <w:rFonts w:ascii="Arial" w:hAnsi="Arial" w:cs="Arial"/>
+          <w:color w:val="000000"/>
+          <w:sz w:val="24"/>
+          <w:szCs w:val="24"/>
+        </w:rPr>
+        <w:t xml:space="preserve">  |  Circulation: </w:t>
+      </w:r>
+      <w:r>
+        <w:rPr>
+          <w:rFonts w:ascii="Arial" w:hAnsi="Arial" w:cs="Arial"/>
+          <w:color w:val="000000"/>
+          <w:sz w:val="24"/>
+          <w:szCs w:val="24"/>
+        </w:rPr>
+        <w:t xml:space="preserve">{circulation_status}</w:t>
+      </w:r>
+    </w:p>
+    <w:p>
+      <w:pPr>
+        <w:jc w:val="both"/>
+        <w:spacing w:before="100" w:after="100" w:line="240" w:lineRule="auto"/>
+      </w:pPr>
+      <w:r>
+        <w:rPr>
+          <w:rFonts w:ascii="Arial" w:hAnsi="Arial" w:cs="Arial"/>
+          <w:color w:val="000000"/>
+          <w:sz w:val="24"/>
+          <w:szCs w:val="24"/>
+        </w:rPr>
+        <w:t xml:space="preserve">• Vital Signs: BP: </w:t>
+      </w:r>
+      <w:r>
+        <w:rPr>
+          <w:rFonts w:ascii="Arial" w:hAnsi="Arial" w:cs="Arial"/>
+          <w:b/>
+          <w:bCs/>
+          <w:color w:val="000000"/>
+          <w:sz w:val="24"/>
+          <w:szCs w:val="24"/>
+        </w:rPr>
+        <w:t xml:space="preserve">{bp}</w:t>
+      </w:r>
+      <w:r>
+        <w:rPr>
+          <w:rFonts w:ascii="Arial" w:hAnsi="Arial" w:cs="Arial"/>
+          <w:color w:val="000000"/>
+          <w:sz w:val="24"/>
+          <w:szCs w:val="24"/>
+        </w:rPr>
+        <w:t xml:space="preserve"> mmHg | Pulse: </w:t>
+      </w:r>
+      <w:r>
+        <w:rPr>
+          <w:rFonts w:ascii="Arial" w:hAnsi="Arial" w:cs="Arial"/>
+          <w:b/>
+          <w:bCs/>
+          <w:color w:val="000000"/>
+          <w:sz w:val="24"/>
+          <w:szCs w:val="24"/>
+        </w:rPr>
+        <w:t xml:space="preserve">{pulse}</w:t>
+      </w:r>
+      <w:r>
+        <w:rPr>
+          <w:rFonts w:ascii="Arial" w:hAnsi="Arial" w:cs="Arial"/>
+          <w:color w:val="000000"/>
+          <w:sz w:val="24"/>
+          <w:szCs w:val="24"/>
+        </w:rPr>
+        <w:t xml:space="preserve"> bpm | RR: </w:t>
+      </w:r>
+      <w:r>
+        <w:rPr>
+          <w:rFonts w:ascii="Arial" w:hAnsi="Arial" w:cs="Arial"/>
+          <w:b/>
+          <w:bCs/>
+          <w:color w:val="000000"/>
+          <w:sz w:val="24"/>
+          <w:szCs w:val="24"/>
+        </w:rPr>
+        <w:t xml:space="preserve">{rr}</w:t>
+      </w:r>
+      <w:r>
+        <w:rPr>
+          <w:rFonts w:ascii="Arial" w:hAnsi="Arial" w:cs="Arial"/>
+          <w:color w:val="000000"/>
+          <w:sz w:val="24"/>
+          <w:szCs w:val="24"/>
+        </w:rPr>
+        <w:t xml:space="preserve"> cpm | SaO₂: </w:t>
+      </w:r>
+      <w:r>
+        <w:rPr>
+          <w:rFonts w:ascii="Arial" w:hAnsi="Arial" w:cs="Arial"/>
+          <w:b/>
+          <w:bCs/>
+          <w:color w:val="000000"/>
+          <w:sz w:val="24"/>
+          <w:szCs w:val="24"/>
+        </w:rPr>
+        <w:t xml:space="preserve">{sao2}</w:t>
+      </w:r>
+      <w:r>
+        <w:rPr>
+          <w:rFonts w:ascii="Arial" w:hAnsi="Arial" w:cs="Arial"/>
+          <w:color w:val="000000"/>
+          <w:sz w:val="24"/>
+          <w:szCs w:val="24"/>
+        </w:rPr>
+        <w:t xml:space="preserve"> | Temp: </w:t>
+      </w:r>
+      <w:r>
+        <w:rPr>
+          <w:rFonts w:ascii="Arial" w:hAnsi="Arial" w:cs="Arial"/>
+          <w:b/>
+          <w:bCs/>
+          <w:color w:val="000000"/>
+          <w:sz w:val="24"/>
+          <w:szCs w:val="24"/>
+        </w:rPr>
+        <w:t xml:space="preserve">{temp}</w:t>
+      </w:r>
+      <w:r>
+        <w:rPr>
+          <w:rFonts w:ascii="Arial" w:hAnsi="Arial" w:cs="Arial"/>
+          <w:color w:val="000000"/>
+          <w:sz w:val="24"/>
+          <w:szCs w:val="24"/>
+        </w:rPr>
+        <w:t xml:space="preserve">°C</w:t>
+      </w:r>
+    </w:p>
+    <w:p>
+      <w:pPr>
+        <w:spacing w:after="100" w:line="240" w:lineRule="auto"/>
+      </w:pPr>
+    </w:p>
+    <w:p>
+      <w:pPr>
+        <w:jc w:val="both"/>
+        <w:spacing w:before="100" w:after="100" w:line="240" w:lineRule="auto"/>
+      </w:pPr>
+      <w:r>
+        <w:rPr>
+          <w:rFonts w:ascii="Arial" w:hAnsi="Arial" w:cs="Arial"/>
+          <w:b/>
+          <w:bCs/>
+          <w:color w:val="000000"/>
+          <w:sz w:val="24"/>
+          <w:szCs w:val="24"/>
+        </w:rPr>
+        <w:t xml:space="preserve">4. Pre-Hospital Care &amp; Interventions:</w:t>
+      </w:r>
+    </w:p>
+    <w:p>
+      <w:pPr>
+        <w:jc w:val="both"/>
+        <w:spacing w:before="100" w:after="100" w:line="240" w:lineRule="auto"/>
+      </w:pPr>
+      <w:r>
+        <w:rPr>
+          <w:rFonts w:ascii="Arial" w:hAnsi="Arial" w:cs="Arial"/>
+          <w:color w:val="000000"/>
+          <w:sz w:val="24"/>
+          <w:szCs w:val="24"/>
+        </w:rPr>
+        <w:t xml:space="preserve">• Interventions Provided: </w:t>
+      </w:r>
+      <w:r>
+        <w:rPr>
+          <w:rFonts w:ascii="Arial" w:hAnsi="Arial" w:cs="Arial"/>
+          <w:color w:val="000000"/>
+          <w:sz w:val="24"/>
+          <w:szCs w:val="24"/>
+        </w:rPr>
+        <w:t xml:space="preserve">{treatment}</w:t>
+      </w:r>
+    </w:p>
+    <w:p>
+      <w:pPr>
+        <w:jc w:val="both"/>
+        <w:spacing w:before="100" w:after="100" w:line="240" w:lineRule="auto"/>
+      </w:pPr>
+      <w:r>
+        <w:rPr>
+          <w:rFonts w:ascii="Arial" w:hAnsi="Arial" w:cs="Arial"/>
+          <w:color w:val="000000"/>
+          <w:sz w:val="24"/>
+          <w:szCs w:val="24"/>
+        </w:rPr>
+        <w:t xml:space="preserve">• Bleeding Controlled: </w:t>
+      </w:r>
+      <w:r>
+        <w:rPr>
+          <w:rFonts w:ascii="Arial" w:hAnsi="Arial" w:cs="Arial"/>
+          <w:b/>
+          <w:bCs/>
+          <w:color w:val="000000"/>
+          <w:sz w:val="24"/>
+          <w:szCs w:val="24"/>
+        </w:rPr>
+        <w:t xml:space="preserve">{bleeding_controlled}</w:t>
+      </w:r>
+      <w:r>
+        <w:rPr>
+          <w:rFonts w:ascii="Arial" w:hAnsi="Arial" w:cs="Arial"/>
+          <w:color w:val="000000"/>
+          <w:sz w:val="24"/>
+          <w:szCs w:val="24"/>
+        </w:rPr>
+        <w:t xml:space="preserve">  |  Immobilized: </w:t>
+      </w:r>
+      <w:r>
+        <w:rPr>
+          <w:rFonts w:ascii="Arial" w:hAnsi="Arial" w:cs="Arial"/>
+          <w:b/>
+          <w:bCs/>
+          <w:color w:val="000000"/>
+          <w:sz w:val="24"/>
+          <w:szCs w:val="24"/>
+        </w:rPr>
+        <w:t xml:space="preserve">{immobilized}</w:t>
+      </w:r>
+      <w:r>
+        <w:rPr>
+          <w:rFonts w:ascii="Arial" w:hAnsi="Arial" w:cs="Arial"/>
+          <w:color w:val="000000"/>
+          <w:sz w:val="24"/>
+          <w:szCs w:val="24"/>
+        </w:rPr>
+        <w:t xml:space="preserve">  |  Wounds Cleaned: </w:t>
+      </w:r>
+      <w:r>
+        <w:rPr>
+          <w:rFonts w:ascii="Arial" w:hAnsi="Arial" w:cs="Arial"/>
+          <w:b/>
+          <w:bCs/>
+          <w:color w:val="000000"/>
+          <w:sz w:val="24"/>
+          <w:szCs w:val="24"/>
+        </w:rPr>
+        <w:t xml:space="preserve">{wounds_cleaned}</w:t>
+      </w:r>
+      <w:r>
+        <w:rPr>
+          <w:rFonts w:ascii="Arial" w:hAnsi="Arial" w:cs="Arial"/>
+          <w:color w:val="000000"/>
+          <w:sz w:val="24"/>
+          <w:szCs w:val="24"/>
+        </w:rPr>
+        <w:t xml:space="preserve">  |  Oxygen Administered: </w:t>
+      </w:r>
+      <w:r>
+        <w:rPr>
+          <w:rFonts w:ascii="Arial" w:hAnsi="Arial" w:cs="Arial"/>
+          <w:b/>
+          <w:bCs/>
+          <w:color w:val="000000"/>
+          <w:sz w:val="24"/>
+          <w:szCs w:val="24"/>
+        </w:rPr>
+        <w:t xml:space="preserve">{oxygen_administered}</w:t>
+      </w:r>
+    </w:p>
+    <w:p>
+      <w:pPr>
+        <w:spacing w:after="100" w:line="240" w:lineRule="auto"/>
+      </w:pPr>
+    </w:p>
+    <w:p>
+      <w:pPr>
+        <w:jc w:val="both"/>
+        <w:spacing w:before="100" w:after="100" w:line="240" w:lineRule="auto"/>
+      </w:pPr>
+      <w:r>
+        <w:rPr>
+          <w:rFonts w:ascii="Arial" w:hAnsi="Arial" w:cs="Arial"/>
+          <w:b/>
+          <w:bCs/>
+          <w:color w:val="000000"/>
+          <w:sz w:val="24"/>
+          <w:szCs w:val="24"/>
+        </w:rPr>
+        <w:t xml:space="preserve">5. Response &amp; Patient Disposition:</w:t>
+      </w:r>
+    </w:p>
+    <w:p>
+      <w:pPr>
+        <w:jc w:val="both"/>
+        <w:spacing w:before="100" w:after="100" w:line="240" w:lineRule="auto"/>
+      </w:pPr>
+      <w:r>
+        <w:rPr>
+          <w:rFonts w:ascii="Arial" w:hAnsi="Arial" w:cs="Arial"/>
+          <w:color w:val="000000"/>
+          <w:sz w:val="24"/>
+          <w:szCs w:val="24"/>
+        </w:rPr>
+        <w:t xml:space="preserve">• Responding Agency: </w:t>
+      </w:r>
+      <w:r>
+        <w:rPr>
+          <w:rFonts w:ascii="Arial" w:hAnsi="Arial" w:cs="Arial"/>
+          <w:b/>
+          <w:bCs/>
+          <w:color w:val="000000"/>
+          <w:sz w:val="24"/>
+          <w:szCs w:val="24"/>
+        </w:rPr>
+        <w:t xml:space="preserve">{responding_agency}</w:t>
+      </w:r>
+      <w:r>
+        <w:rPr>
+          <w:rFonts w:ascii="Arial" w:hAnsi="Arial" w:cs="Arial"/>
+          <w:color w:val="000000"/>
+          <w:sz w:val="24"/>
+          <w:szCs w:val="24"/>
+        </w:rPr>
+        <w:t xml:space="preserve"> | Responders: </w:t>
+      </w:r>
+      <w:r>
+        <w:rPr>
+          <w:rFonts w:ascii="Arial" w:hAnsi="Arial" w:cs="Arial"/>
+          <w:color w:val="000000"/>
+          <w:sz w:val="24"/>
+          <w:szCs w:val="24"/>
+        </w:rPr>
+        <w:t xml:space="preserve">{responder_names}</w:t>
+      </w:r>
+    </w:p>
+    <w:p>
+      <w:pPr>
+        <w:jc w:val="both"/>
+        <w:spacing w:before="100" w:after="100" w:line="240" w:lineRule="auto"/>
+      </w:pPr>
+      <w:r>
+        <w:rPr>
+          <w:rFonts w:ascii="Arial" w:hAnsi="Arial" w:cs="Arial"/>
+          <w:color w:val="000000"/>
+          <w:sz w:val="24"/>
+          <w:szCs w:val="24"/>
+        </w:rPr>
+        <w:t xml:space="preserve">• Arrival Time: </w:t>
+      </w:r>
+      <w:r>
+        <w:rPr>
+          <w:rFonts w:ascii="Arial" w:hAnsi="Arial" w:cs="Arial"/>
+          <w:color w:val="000000"/>
+          <w:sz w:val="24"/>
+          <w:szCs w:val="24"/>
+        </w:rPr>
+        <w:t xml:space="preserve">{arrival_time}</w:t>
+      </w:r>
+      <w:r>
+        <w:rPr>
+          <w:rFonts w:ascii="Arial" w:hAnsi="Arial" w:cs="Arial"/>
+          <w:color w:val="000000"/>
+          <w:sz w:val="24"/>
+          <w:szCs w:val="24"/>
+        </w:rPr>
+        <w:t xml:space="preserve"> | Departure Time: </w:t>
+      </w:r>
+      <w:r>
+        <w:rPr>
+          <w:rFonts w:ascii="Arial" w:hAnsi="Arial" w:cs="Arial"/>
+          <w:color w:val="000000"/>
+          <w:sz w:val="24"/>
+          <w:szCs w:val="24"/>
+        </w:rPr>
+        <w:t xml:space="preserve">{departure_time}</w:t>
+      </w:r>
+    </w:p>
+    <w:p>
+      <w:pPr>
+        <w:jc w:val="both"/>
+        <w:spacing w:before="100" w:after="100" w:line="240" w:lineRule="auto"/>
+      </w:pPr>
+      <w:r>
+        <w:rPr>
+          <w:rFonts w:ascii="Arial" w:hAnsi="Arial" w:cs="Arial"/>
+          <w:color w:val="000000"/>
+          <w:sz w:val="24"/>
+          <w:szCs w:val="24"/>
+        </w:rPr>
+        <w:t xml:space="preserve">• Disposition Status: </w:t>
+      </w:r>
+      <w:r>
+        <w:rPr>
+          <w:rFonts w:ascii="Arial" w:hAnsi="Arial" w:cs="Arial"/>
+          <w:b/>
+          <w:bCs/>
+          <w:color w:val="000000"/>
+          <w:sz w:val="24"/>
+          <w:szCs w:val="24"/>
+        </w:rPr>
+        <w:t xml:space="preserve">{disposition_status}</w:t>
+      </w:r>
+    </w:p>
+    <w:p>
+      <w:pPr>
+        <w:jc w:val="both"/>
+        <w:spacing w:before="100" w:after="100" w:line="240" w:lineRule="auto"/>
+      </w:pPr>
+      <w:r>
+        <w:rPr>
+          <w:rFonts w:ascii="Arial" w:hAnsi="Arial" w:cs="Arial"/>
+          <w:color w:val="000000"/>
+          <w:sz w:val="24"/>
+          <w:szCs w:val="24"/>
+        </w:rPr>
+        <w:t xml:space="preserve">• Destination Facility: </w:t>
+      </w:r>
+      <w:r>
+        <w:rPr>
+          <w:rFonts w:ascii="Arial" w:hAnsi="Arial" w:cs="Arial"/>
+          <w:b/>
+          <w:bCs/>
+          <w:color w:val="000000"/>
+          <w:sz w:val="24"/>
+          <w:szCs w:val="24"/>
+        </w:rPr>
+        <w:t xml:space="preserve">{destination_facility}</w:t>
+      </w:r>
+      <w:r>
+        <w:rPr>
+          <w:rFonts w:ascii="Arial" w:hAnsi="Arial" w:cs="Arial"/>
+          <w:color w:val="000000"/>
+          <w:sz w:val="24"/>
+          <w:szCs w:val="24"/>
+        </w:rPr>
+        <w:t xml:space="preserve"> | Transport Time: </w:t>
+      </w:r>
+      <w:r>
+        <w:rPr>
+          <w:rFonts w:ascii="Arial" w:hAnsi="Arial" w:cs="Arial"/>
+          <w:color w:val="000000"/>
+          <w:sz w:val="24"/>
+          <w:szCs w:val="24"/>
+        </w:rPr>
+        <w:t xml:space="preserve">{transport_time}</w:t>
+      </w:r>
+    </w:p>
+    <w:p>
+      <w:pPr>
+        <w:jc w:val="both"/>
+        <w:spacing w:before="100" w:after="100" w:line="240" w:lineRule="auto"/>
+      </w:pPr>
+      <w:r>
+        <w:rPr>
+          <w:rFonts w:ascii="Arial" w:hAnsi="Arial" w:cs="Arial"/>
+          <w:color w:val="000000"/>
+          <w:sz w:val="24"/>
+          <w:szCs w:val="24"/>
+        </w:rPr>
+        <w:t xml:space="preserve">• Status Upon Turnover: </w:t>
+      </w:r>
+      <w:r>
+        <w:rPr>
+          <w:rFonts w:ascii="Arial" w:hAnsi="Arial" w:cs="Arial"/>
+          <w:color w:val="000000"/>
+          <w:sz w:val="24"/>
+          <w:szCs w:val="24"/>
+        </w:rPr>
+        <w:t xml:space="preserve">{turnover_status}</w:t>
+      </w:r>
+    </w:p>
+    <w:p>
+      <w:pPr>
+        <w:spacing w:after="100" w:line="240" w:lineRule="auto"/>
+      </w:pPr>
+    </w:p>
+    <w:p>
+      <w:pPr>
+        <w:jc w:val="both"/>
+        <w:spacing w:before="100" w:after="100" w:line="240" w:lineRule="auto"/>
+      </w:pPr>
+      <w:r>
+        <w:rPr>
+          <w:rFonts w:ascii="Arial" w:hAnsi="Arial" w:cs="Arial"/>
+          <w:color w:val="000000"/>
+          <w:sz w:val="24"/>
+          <w:szCs w:val="24"/>
+        </w:rPr>
+        <w:t xml:space="preserve">{procedure_photo_note}</w:t>
+      </w:r>
+    </w:p>
+    <w:p>
+      <w:pPr>
+        <w:spacing w:after="100" w:line="240" w:lineRule="auto"/>
+      </w:pPr>
+    </w:p>
+    <w:p>
+      <w:pPr>
+        <w:jc w:val="center"/>
+        <w:spacing w:before="240" w:after="240"/>
+      </w:pPr>
+      <w:r>
+        <w:drawing>
+          <wp:inline xmlns:wp="http://schemas.openxmlformats.org/drawingml/2006/wordprocessingDrawing" xmlns:a="http://schemas.openxmlformats.org/drawingml/2006/main" xmlns:pic="http://schemas.openxmlformats.org/drawingml/2006/picture" xmlns:r="http://schemas.openxmlformats.org/officeDocument/2006/relationships" distT="0" distB="0" distL="0" distR="0">
+            <wp:extent cx="5400000" cy="1800000"/>
+            <wp:docPr id="1001" name="Signature Block 1001"/>
+            <a:graphic>
+              <a:graphicData uri="http://schemas.openxmlformats.org/drawingml/2006/main">
+                <pic:pic>
+                  <pic:nvPicPr>
+                    <pic:cNvPr id="1001" name="signature_block.png"/>
+                    <pic:cNvPicPr/>
+                  </pic:nvPicPr>
+                  <pic:blipFill>
+                    <a:blip r:embed="rIdSig"/>
+                    <a:stretch>
+                      <a:fillRect/>
+                    </a:stretch>
+                  </pic:blipFill>
+                  <pic:spPr>
+                    <a:xfrm>
+                      <a:off x="0" y="0"/>
+                      <a:ext cx="5400000" cy="1800000"/>
+                    </a:xfrm>
+                    <a:prstGeom prst="rect">
+                      <a:avLst/>
+                    </a:prstGeom>
+                  </pic:spPr>
+                </pic:pic>
+              </a:graphicData>
+            </a:graphic>
+          </wp:inline>
+        </w:drawing>
+      </w:r>
+    </w:p>
+    <w:p>
+      <w:pPr>
+        <w:spacing w:after="100" w:line="240" w:lineRule="auto"/>
+      </w:pPr>
+      <w:r>
+        <w:rPr>
+          <w:rFonts w:ascii="Arial" w:hAnsi="Arial" w:cs="Arial"/>
+          <w:color w:val="000000"/>
+          <w:sz w:val="24"/>
+          <w:szCs w:val="24"/>
+        </w:rPr>
+        <w:t xml:space="preserve">{/incidents}</w:t>
+      </w:r>
+    </w:p>
+    <w:sectPr>
+      <w:headerReference w:type="default" r:id="rId82"/>
+      <w:footerReference w:type="default" r:id="rId83"/>
+      <w:pgSz w:w="12240" w:h="18720" w:code="14"/>
+      <w:pgMar w:top="1440" w:right="1440" w:bottom="1440" w:left="1440" w:header="708" w:footer="708" w:gutter="0"/>
+      <w:cols w:space="708"/>
+      <w:docGrid w:linePitch="360"/>
+    </w:sectPr>
+  </w:body>
+</w:document>
 </file>
 
 <file path=word/endnotes.xml><?xml version="1.0" encoding="utf-8"?>

</xml_diff>